<commit_message>
fix(workbuddy): prevent template images in advancement opinions
</commit_message>
<xml_diff>
--- a/skills/workbuddy/assets/推进意见模板.docx
+++ b/skills/workbuddy/assets/推进意见模板.docx
@@ -2186,43 +2186,6 @@
           <w:szCs w:val="28"/>
           <w:lang w:val="en-US" w:eastAsia="zh-CN" w:bidi="ar"/>
         </w:rPr>
-        <w:drawing>
-          <wp:inline distT="0" distB="0" distL="114300" distR="114300">
-            <wp:extent cx="5274310" cy="3247390"/>
-            <wp:effectExtent l="0" t="0" r="2540" b="10160"/>
-            <wp:docPr id="2" name="图片 2" descr="14779984346875424293"/>
-            <wp:cNvGraphicFramePr>
-              <a:graphicFrameLocks xmlns:a="http://schemas.openxmlformats.org/drawingml/2006/main" noChangeAspect="1"/>
-            </wp:cNvGraphicFramePr>
-            <a:graphic xmlns:a="http://schemas.openxmlformats.org/drawingml/2006/main">
-              <a:graphicData uri="http://schemas.openxmlformats.org/drawingml/2006/picture">
-                <pic:pic xmlns:pic="http://schemas.openxmlformats.org/drawingml/2006/picture">
-                  <pic:nvPicPr>
-                    <pic:cNvPr id="2" name="图片 2" descr="14779984346875424293"/>
-                    <pic:cNvPicPr>
-                      <a:picLocks noChangeAspect="1"/>
-                    </pic:cNvPicPr>
-                  </pic:nvPicPr>
-                  <pic:blipFill>
-                    <a:blip r:embed="rId4"/>
-                    <a:stretch>
-                      <a:fillRect/>
-                    </a:stretch>
-                  </pic:blipFill>
-                  <pic:spPr>
-                    <a:xfrm>
-                      <a:off x="0" y="0"/>
-                      <a:ext cx="5274310" cy="3247390"/>
-                    </a:xfrm>
-                    <a:prstGeom prst="rect">
-                      <a:avLst/>
-                    </a:prstGeom>
-                  </pic:spPr>
-                </pic:pic>
-              </a:graphicData>
-            </a:graphic>
-          </wp:inline>
-        </w:drawing>
       </w:r>
     </w:p>
     <w:p>

</xml_diff>